<commit_message>
Minor push, small additions to report
</commit_message>
<xml_diff>
--- a/Low Battery Final Report.docx
+++ b/Low Battery Final Report.docx
@@ -34,17 +34,50 @@
           <w:szCs w:val="28"/>
         </w:rPr>
         <w:tab/>
-        <w:t>Progress Report</w:t>
+        <w:t>Phase 2</w:t>
       </w:r>
-    </w:p>
-    <w:p>
-      <w:pPr>
-        <w:rPr>
-          <w:rFonts w:ascii="Bahnschrift SemiLight" w:hAnsi="Bahnschrift SemiLight"/>
-          <w:sz w:val="28"/>
-          <w:szCs w:val="28"/>
-        </w:rPr>
-      </w:pPr>
+      <w:r>
+        <w:rPr>
+          <w:rFonts w:ascii="Bahnschrift SemiLight" w:hAnsi="Bahnschrift SemiLight"/>
+          <w:sz w:val="28"/>
+          <w:szCs w:val="28"/>
+        </w:rPr>
+        <w:tab/>
+      </w:r>
+      <w:r>
+        <w:rPr>
+          <w:rFonts w:ascii="Bahnschrift SemiLight" w:hAnsi="Bahnschrift SemiLight"/>
+          <w:sz w:val="28"/>
+          <w:szCs w:val="28"/>
+        </w:rPr>
+        <w:tab/>
+        <w:t>Final report</w:t>
+      </w:r>
+    </w:p>
+    <w:p>
+      <w:pPr>
+        <w:rPr>
+          <w:rFonts w:ascii="Bahnschrift SemiLight" w:hAnsi="Bahnschrift SemiLight"/>
+        </w:rPr>
+      </w:pPr>
+      <w:r>
+        <w:rPr>
+          <w:rFonts w:ascii="Bahnschrift SemiLight" w:hAnsi="Bahnschrift SemiLight"/>
+        </w:rPr>
+        <w:t>Erin Sandra Christopher (24222848)</w:t>
+      </w:r>
+      <w:r>
+        <w:rPr>
+          <w:rFonts w:ascii="Bahnschrift SemiLight" w:hAnsi="Bahnschrift SemiLight"/>
+        </w:rPr>
+        <w:tab/>
+      </w:r>
+      <w:r>
+        <w:rPr>
+          <w:rFonts w:ascii="Bahnschrift SemiLight" w:hAnsi="Bahnschrift SemiLight"/>
+        </w:rPr>
+        <w:t>Huyin Song (25331396)</w:t>
+      </w:r>
     </w:p>
     <w:p>
       <w:pPr>
@@ -1573,7 +1606,6 @@
   <w:style w:type="character" w:default="1" w:styleId="DefaultParagraphFont">
     <w:name w:val="Default Paragraph Font"/>
     <w:uiPriority w:val="1"/>
-    <w:semiHidden/>
     <w:unhideWhenUsed/>
   </w:style>
   <w:style w:type="table" w:default="1" w:styleId="TableNormal">

</xml_diff>